<commit_message>
Fix bullet encoding in Word guides
</commit_message>
<xml_diff>
--- a/docs/HUONG_DAN_BUILD_VA_PHAT_HANH_PC_POS_VI.docx
+++ b/docs/HUONG_DAN_BUILD_VA_PHAT_HANH_PC_POS_VI.docx
@@ -127,39 +127,39 @@
         <w:pStyle w:val="Normal"/>
       </w:pPr>
       <w:r>
-        <w:t>â€¢ Windows 64-bit.</w:t>
-      </w:r>
-    </w:p>
-    <w:p>
-      <w:pPr>
-        <w:pStyle w:val="Normal"/>
-      </w:pPr>
-      <w:r>
-        <w:t>â€¢ Android.</w:t>
-      </w:r>
-    </w:p>
-    <w:p>
-      <w:pPr>
-        <w:pStyle w:val="Normal"/>
-      </w:pPr>
-      <w:r>
-        <w:t>â€¢ Cập nhật code bằng Shorebird.</w:t>
-      </w:r>
-    </w:p>
-    <w:p>
-      <w:pPr>
-        <w:pStyle w:val="Normal"/>
-      </w:pPr>
-      <w:r>
-        <w:t>â€¢ Cập nhật Windows qua file appcast XML và WinSparkle.</w:t>
-      </w:r>
-    </w:p>
-    <w:p>
-      <w:pPr>
-        <w:pStyle w:val="Normal"/>
-      </w:pPr>
-      <w:r>
-        <w:t>â€¢ Đóng gói Windows bằng Inno Setup.</w:t>
+        <w:t>• Windows 64-bit.</w:t>
+      </w:r>
+    </w:p>
+    <w:p>
+      <w:pPr>
+        <w:pStyle w:val="Normal"/>
+      </w:pPr>
+      <w:r>
+        <w:t>• Android.</w:t>
+      </w:r>
+    </w:p>
+    <w:p>
+      <w:pPr>
+        <w:pStyle w:val="Normal"/>
+      </w:pPr>
+      <w:r>
+        <w:t>• Cập nhật code bằng Shorebird.</w:t>
+      </w:r>
+    </w:p>
+    <w:p>
+      <w:pPr>
+        <w:pStyle w:val="Normal"/>
+      </w:pPr>
+      <w:r>
+        <w:t>• Cập nhật Windows qua file appcast XML và WinSparkle.</w:t>
+      </w:r>
+    </w:p>
+    <w:p>
+      <w:pPr>
+        <w:pStyle w:val="Normal"/>
+      </w:pPr>
+      <w:r>
+        <w:t>• Đóng gói Windows bằng Inno Setup.</w:t>
       </w:r>
     </w:p>
     <w:p>
@@ -423,23 +423,23 @@
         <w:pStyle w:val="Normal"/>
       </w:pPr>
       <w:r>
-        <w:t>â€¢ `1.3.0` là version hiển thị cho người dùng.</w:t>
-      </w:r>
-    </w:p>
-    <w:p>
-      <w:pPr>
-        <w:pStyle w:val="Normal"/>
-      </w:pPr>
-      <w:r>
-        <w:t>â€¢ `26` là build number nội bộ.</w:t>
-      </w:r>
-    </w:p>
-    <w:p>
-      <w:pPr>
-        <w:pStyle w:val="Normal"/>
-      </w:pPr>
-      <w:r>
-        <w:t>â€¢ Chuỗi đầy đủ là `1.3.0+26`.</w:t>
+        <w:t>• `1.3.0` là version hiển thị cho người dùng.</w:t>
+      </w:r>
+    </w:p>
+    <w:p>
+      <w:pPr>
+        <w:pStyle w:val="Normal"/>
+      </w:pPr>
+      <w:r>
+        <w:t>• `26` là build number nội bộ.</w:t>
+      </w:r>
+    </w:p>
+    <w:p>
+      <w:pPr>
+        <w:pStyle w:val="Normal"/>
+      </w:pPr>
+      <w:r>
+        <w:t>• Chuỗi đầy đủ là `1.3.0+26`.</w:t>
       </w:r>
     </w:p>
     <w:p>
@@ -2423,31 +2423,31 @@
         <w:pStyle w:val="Normal"/>
       </w:pPr>
       <w:r>
-        <w:t>â€¢ `dsa_priv.pem` là private key, tuyệt đối không đưa lên server download.</w:t>
-      </w:r>
-    </w:p>
-    <w:p>
-      <w:pPr>
-        <w:pStyle w:val="Normal"/>
-      </w:pPr>
-      <w:r>
-        <w:t>â€¢ Không cho private key vào ZIP phát hành.</w:t>
-      </w:r>
-    </w:p>
-    <w:p>
-      <w:pPr>
-        <w:pStyle w:val="Normal"/>
-      </w:pPr>
-      <w:r>
-        <w:t>â€¢ Không commit private key vào repository public.</w:t>
-      </w:r>
-    </w:p>
-    <w:p>
-      <w:pPr>
-        <w:pStyle w:val="Normal"/>
-      </w:pPr>
-      <w:r>
-        <w:t>â€¢ Chỉ người phụ trách release được quyền truy cập private key.</w:t>
+        <w:t>• `dsa_priv.pem` là private key, tuyệt đối không đưa lên server download.</w:t>
+      </w:r>
+    </w:p>
+    <w:p>
+      <w:pPr>
+        <w:pStyle w:val="Normal"/>
+      </w:pPr>
+      <w:r>
+        <w:t>• Không cho private key vào ZIP phát hành.</w:t>
+      </w:r>
+    </w:p>
+    <w:p>
+      <w:pPr>
+        <w:pStyle w:val="Normal"/>
+      </w:pPr>
+      <w:r>
+        <w:t>• Không commit private key vào repository public.</w:t>
+      </w:r>
+    </w:p>
+    <w:p>
+      <w:pPr>
+        <w:pStyle w:val="Normal"/>
+      </w:pPr>
+      <w:r>
+        <w:t>• Chỉ người phụ trách release được quyền truy cập private key.</w:t>
       </w:r>
     </w:p>
     <w:p>
@@ -3319,31 +3319,31 @@
         <w:pStyle w:val="Normal"/>
       </w:pPr>
       <w:r>
-        <w:t>â€¢ `dsa_priv.pem`.</w:t>
-      </w:r>
-    </w:p>
-    <w:p>
-      <w:pPr>
-        <w:pStyle w:val="Normal"/>
-      </w:pPr>
-      <w:r>
-        <w:t>â€¢ Shorebird credentials.</w:t>
-      </w:r>
-    </w:p>
-    <w:p>
-      <w:pPr>
-        <w:pStyle w:val="Normal"/>
-      </w:pPr>
-      <w:r>
-        <w:t>â€¢ Source code không cần thiết.</w:t>
-      </w:r>
-    </w:p>
-    <w:p>
-      <w:pPr>
-        <w:pStyle w:val="Normal"/>
-      </w:pPr>
-      <w:r>
-        <w:t>â€¢ File log chứa thông tin khách hàng.</w:t>
+        <w:t>• `dsa_priv.pem`.</w:t>
+      </w:r>
+    </w:p>
+    <w:p>
+      <w:pPr>
+        <w:pStyle w:val="Normal"/>
+      </w:pPr>
+      <w:r>
+        <w:t>• Shorebird credentials.</w:t>
+      </w:r>
+    </w:p>
+    <w:p>
+      <w:pPr>
+        <w:pStyle w:val="Normal"/>
+      </w:pPr>
+      <w:r>
+        <w:t>• Source code không cần thiết.</w:t>
+      </w:r>
+    </w:p>
+    <w:p>
+      <w:pPr>
+        <w:pStyle w:val="Normal"/>
+      </w:pPr>
+      <w:r>
+        <w:t>• File log chứa thông tin khách hàng.</w:t>
       </w:r>
     </w:p>
     <w:p>
@@ -3751,47 +3751,47 @@
         <w:pStyle w:val="Normal"/>
       </w:pPr>
       <w:r>
-        <w:t>â€¢ Cài APK trên ít nhất một thiết bị Android.</w:t>
-      </w:r>
-    </w:p>
-    <w:p>
-      <w:pPr>
-        <w:pStyle w:val="Normal"/>
-      </w:pPr>
-      <w:r>
-        <w:t>â€¢ Kiểm tra app mở đúng domain.</w:t>
-      </w:r>
-    </w:p>
-    <w:p>
-      <w:pPr>
-        <w:pStyle w:val="Normal"/>
-      </w:pPr>
-      <w:r>
-        <w:t>â€¢ Đăng nhập được.</w:t>
-      </w:r>
-    </w:p>
-    <w:p>
-      <w:pPr>
-        <w:pStyle w:val="Normal"/>
-      </w:pPr>
-      <w:r>
-        <w:t>â€¢ Thử các chức năng chính.</w:t>
-      </w:r>
-    </w:p>
-    <w:p>
-      <w:pPr>
-        <w:pStyle w:val="Normal"/>
-      </w:pPr>
-      <w:r>
-        <w:t>â€¢ Kiểm tra in nếu thiết bị có máy in.</w:t>
-      </w:r>
-    </w:p>
-    <w:p>
-      <w:pPr>
-        <w:pStyle w:val="Normal"/>
-      </w:pPr>
-      <w:r>
-        <w:t>â€¢ Đóng và mở lại app.</w:t>
+        <w:t>• Cài APK trên ít nhất một thiết bị Android.</w:t>
+      </w:r>
+    </w:p>
+    <w:p>
+      <w:pPr>
+        <w:pStyle w:val="Normal"/>
+      </w:pPr>
+      <w:r>
+        <w:t>• Kiểm tra app mở đúng domain.</w:t>
+      </w:r>
+    </w:p>
+    <w:p>
+      <w:pPr>
+        <w:pStyle w:val="Normal"/>
+      </w:pPr>
+      <w:r>
+        <w:t>• Đăng nhập được.</w:t>
+      </w:r>
+    </w:p>
+    <w:p>
+      <w:pPr>
+        <w:pStyle w:val="Normal"/>
+      </w:pPr>
+      <w:r>
+        <w:t>• Thử các chức năng chính.</w:t>
+      </w:r>
+    </w:p>
+    <w:p>
+      <w:pPr>
+        <w:pStyle w:val="Normal"/>
+      </w:pPr>
+      <w:r>
+        <w:t>• Kiểm tra in nếu thiết bị có máy in.</w:t>
+      </w:r>
+    </w:p>
+    <w:p>
+      <w:pPr>
+        <w:pStyle w:val="Normal"/>
+      </w:pPr>
+      <w:r>
+        <w:t>• Đóng và mở lại app.</w:t>
       </w:r>
     </w:p>
     <w:p>
@@ -3823,55 +3823,55 @@
         <w:pStyle w:val="Normal"/>
       </w:pPr>
       <w:r>
-        <w:t>â€¢ Cài bằng file Inno EXE trên một máy sạch hoặc máy kiểm thử.</w:t>
-      </w:r>
-    </w:p>
-    <w:p>
-      <w:pPr>
-        <w:pStyle w:val="Normal"/>
-      </w:pPr>
-      <w:r>
-        <w:t>â€¢ Kiểm tra shortcut.</w:t>
-      </w:r>
-    </w:p>
-    <w:p>
-      <w:pPr>
-        <w:pStyle w:val="Normal"/>
-      </w:pPr>
-      <w:r>
-        <w:t>â€¢ Kiểm tra WebView2.</w:t>
-      </w:r>
-    </w:p>
-    <w:p>
-      <w:pPr>
-        <w:pStyle w:val="Normal"/>
-      </w:pPr>
-      <w:r>
-        <w:t>â€¢ Kiểm tra đúng domain.</w:t>
-      </w:r>
-    </w:p>
-    <w:p>
-      <w:pPr>
-        <w:pStyle w:val="Normal"/>
-      </w:pPr>
-      <w:r>
-        <w:t>â€¢ Đăng nhập và thử chức năng chính.</w:t>
-      </w:r>
-    </w:p>
-    <w:p>
-      <w:pPr>
-        <w:pStyle w:val="Normal"/>
-      </w:pPr>
-      <w:r>
-        <w:t>â€¢ Kiểm tra in và màn hình phụ nếu có.</w:t>
-      </w:r>
-    </w:p>
-    <w:p>
-      <w:pPr>
-        <w:pStyle w:val="Normal"/>
-      </w:pPr>
-      <w:r>
-        <w:t>â€¢ Kiểm tra appcast tải đúng installer.</w:t>
+        <w:t>• Cài bằng file Inno EXE trên một máy sạch hoặc máy kiểm thử.</w:t>
+      </w:r>
+    </w:p>
+    <w:p>
+      <w:pPr>
+        <w:pStyle w:val="Normal"/>
+      </w:pPr>
+      <w:r>
+        <w:t>• Kiểm tra shortcut.</w:t>
+      </w:r>
+    </w:p>
+    <w:p>
+      <w:pPr>
+        <w:pStyle w:val="Normal"/>
+      </w:pPr>
+      <w:r>
+        <w:t>• Kiểm tra WebView2.</w:t>
+      </w:r>
+    </w:p>
+    <w:p>
+      <w:pPr>
+        <w:pStyle w:val="Normal"/>
+      </w:pPr>
+      <w:r>
+        <w:t>• Kiểm tra đúng domain.</w:t>
+      </w:r>
+    </w:p>
+    <w:p>
+      <w:pPr>
+        <w:pStyle w:val="Normal"/>
+      </w:pPr>
+      <w:r>
+        <w:t>• Đăng nhập và thử chức năng chính.</w:t>
+      </w:r>
+    </w:p>
+    <w:p>
+      <w:pPr>
+        <w:pStyle w:val="Normal"/>
+      </w:pPr>
+      <w:r>
+        <w:t>• Kiểm tra in và màn hình phụ nếu có.</w:t>
+      </w:r>
+    </w:p>
+    <w:p>
+      <w:pPr>
+        <w:pStyle w:val="Normal"/>
+      </w:pPr>
+      <w:r>
+        <w:t>• Kiểm tra appcast tải đúng installer.</w:t>
       </w:r>
     </w:p>
     <w:p>
@@ -3903,55 +3903,55 @@
         <w:pStyle w:val="Normal"/>
       </w:pPr>
       <w:r>
-        <w:t>â€¢ Tên file đúng version.</w:t>
-      </w:r>
-    </w:p>
-    <w:p>
-      <w:pPr>
-        <w:pStyle w:val="Normal"/>
-      </w:pPr>
-      <w:r>
-        <w:t>â€¢ XML đúng domain.</w:t>
-      </w:r>
-    </w:p>
-    <w:p>
-      <w:pPr>
-        <w:pStyle w:val="Normal"/>
-      </w:pPr>
-      <w:r>
-        <w:t>â€¢ XML đúng build number.</w:t>
-      </w:r>
-    </w:p>
-    <w:p>
-      <w:pPr>
-        <w:pStyle w:val="Normal"/>
-      </w:pPr>
-      <w:r>
-        <w:t>â€¢ `length` bằng chính xác kích thước EXE.</w:t>
-      </w:r>
-    </w:p>
-    <w:p>
-      <w:pPr>
-        <w:pStyle w:val="Normal"/>
-      </w:pPr>
-      <w:r>
-        <w:t>â€¢ DSA signature đã `Verified OK`.</w:t>
-      </w:r>
-    </w:p>
-    <w:p>
-      <w:pPr>
-        <w:pStyle w:val="Normal"/>
-      </w:pPr>
-      <w:r>
-        <w:t>â€¢ ZIP không chứa private key.</w:t>
-      </w:r>
-    </w:p>
-    <w:p>
-      <w:pPr>
-        <w:pStyle w:val="Normal"/>
-      </w:pPr>
-      <w:r>
-        <w:t>â€¢ Shorebird hiển thị release đúng version cho cả Android và Windows.</w:t>
+        <w:t>• Tên file đúng version.</w:t>
+      </w:r>
+    </w:p>
+    <w:p>
+      <w:pPr>
+        <w:pStyle w:val="Normal"/>
+      </w:pPr>
+      <w:r>
+        <w:t>• XML đúng domain.</w:t>
+      </w:r>
+    </w:p>
+    <w:p>
+      <w:pPr>
+        <w:pStyle w:val="Normal"/>
+      </w:pPr>
+      <w:r>
+        <w:t>• XML đúng build number.</w:t>
+      </w:r>
+    </w:p>
+    <w:p>
+      <w:pPr>
+        <w:pStyle w:val="Normal"/>
+      </w:pPr>
+      <w:r>
+        <w:t>• `length` bằng chính xác kích thước EXE.</w:t>
+      </w:r>
+    </w:p>
+    <w:p>
+      <w:pPr>
+        <w:pStyle w:val="Normal"/>
+      </w:pPr>
+      <w:r>
+        <w:t>• DSA signature đã `Verified OK`.</w:t>
+      </w:r>
+    </w:p>
+    <w:p>
+      <w:pPr>
+        <w:pStyle w:val="Normal"/>
+      </w:pPr>
+      <w:r>
+        <w:t>• ZIP không chứa private key.</w:t>
+      </w:r>
+    </w:p>
+    <w:p>
+      <w:pPr>
+        <w:pStyle w:val="Normal"/>
+      </w:pPr>
+      <w:r>
+        <w:t>• Shorebird hiển thị release đúng version cho cả Android và Windows.</w:t>
       </w:r>
     </w:p>
     <w:p>
@@ -4127,55 +4127,55 @@
         <w:pStyle w:val="Normal"/>
       </w:pPr>
       <w:r>
-        <w:t>â€¢ Android Manifest hoặc quyền Android.</w:t>
-      </w:r>
-    </w:p>
-    <w:p>
-      <w:pPr>
-        <w:pStyle w:val="Normal"/>
-      </w:pPr>
-      <w:r>
-        <w:t>â€¢ Gradle/Kotlin.</w:t>
-      </w:r>
-    </w:p>
-    <w:p>
-      <w:pPr>
-        <w:pStyle w:val="Normal"/>
-      </w:pPr>
-      <w:r>
-        <w:t>â€¢ Native Android code.</w:t>
-      </w:r>
-    </w:p>
-    <w:p>
-      <w:pPr>
-        <w:pStyle w:val="Normal"/>
-      </w:pPr>
-      <w:r>
-        <w:t>â€¢ C++ runner Windows.</w:t>
-      </w:r>
-    </w:p>
-    <w:p>
-      <w:pPr>
-        <w:pStyle w:val="Normal"/>
-      </w:pPr>
-      <w:r>
-        <w:t>â€¢ DLL/plugin native.</w:t>
-      </w:r>
-    </w:p>
-    <w:p>
-      <w:pPr>
-        <w:pStyle w:val="Normal"/>
-      </w:pPr>
-      <w:r>
-        <w:t>â€¢ Inno Setup.</w:t>
-      </w:r>
-    </w:p>
-    <w:p>
-      <w:pPr>
-        <w:pStyle w:val="Normal"/>
-      </w:pPr>
-      <w:r>
-        <w:t>â€¢ Public key cập nhật.</w:t>
+        <w:t>• Android Manifest hoặc quyền Android.</w:t>
+      </w:r>
+    </w:p>
+    <w:p>
+      <w:pPr>
+        <w:pStyle w:val="Normal"/>
+      </w:pPr>
+      <w:r>
+        <w:t>• Gradle/Kotlin.</w:t>
+      </w:r>
+    </w:p>
+    <w:p>
+      <w:pPr>
+        <w:pStyle w:val="Normal"/>
+      </w:pPr>
+      <w:r>
+        <w:t>• Native Android code.</w:t>
+      </w:r>
+    </w:p>
+    <w:p>
+      <w:pPr>
+        <w:pStyle w:val="Normal"/>
+      </w:pPr>
+      <w:r>
+        <w:t>• C++ runner Windows.</w:t>
+      </w:r>
+    </w:p>
+    <w:p>
+      <w:pPr>
+        <w:pStyle w:val="Normal"/>
+      </w:pPr>
+      <w:r>
+        <w:t>• DLL/plugin native.</w:t>
+      </w:r>
+    </w:p>
+    <w:p>
+      <w:pPr>
+        <w:pStyle w:val="Normal"/>
+      </w:pPr>
+      <w:r>
+        <w:t>• Inno Setup.</w:t>
+      </w:r>
+    </w:p>
+    <w:p>
+      <w:pPr>
+        <w:pStyle w:val="Normal"/>
+      </w:pPr>
+      <w:r>
+        <w:t>• Public key cập nhật.</w:t>
       </w:r>
     </w:p>
     <w:p>
@@ -4575,23 +4575,23 @@
         <w:pStyle w:val="Normal"/>
       </w:pPr>
       <w:r>
-        <w:t>â€¢ Thay đổi chủ động: domain, version, Inno config.</w:t>
-      </w:r>
-    </w:p>
-    <w:p>
-      <w:pPr>
-        <w:pStyle w:val="Normal"/>
-      </w:pPr>
-      <w:r>
-        <w:t>â€¢ Thay đổi sinh tự động: `pubspec.lock`, build output, file ephemeral.</w:t>
-      </w:r>
-    </w:p>
-    <w:p>
-      <w:pPr>
-        <w:pStyle w:val="Normal"/>
-      </w:pPr>
-      <w:r>
-        <w:t>â€¢ Thay đổi của người khác đã tồn tại trước khi build.</w:t>
+        <w:t>• Thay đổi chủ động: domain, version, Inno config.</w:t>
+      </w:r>
+    </w:p>
+    <w:p>
+      <w:pPr>
+        <w:pStyle w:val="Normal"/>
+      </w:pPr>
+      <w:r>
+        <w:t>• Thay đổi sinh tự động: `pubspec.lock`, build output, file ephemeral.</w:t>
+      </w:r>
+    </w:p>
+    <w:p>
+      <w:pPr>
+        <w:pStyle w:val="Normal"/>
+      </w:pPr>
+      <w:r>
+        <w:t>• Thay đổi của người khác đã tồn tại trước khi build.</w:t>
       </w:r>
     </w:p>
     <w:p>
@@ -4703,191 +4703,191 @@
         <w:pStyle w:val="Normal"/>
       </w:pPr>
       <w:r>
-        <w:t>â€¢ [ ] Source đã cập nhật mới nhất.</w:t>
-      </w:r>
-    </w:p>
-    <w:p>
-      <w:pPr>
-        <w:pStyle w:val="Normal"/>
-      </w:pPr>
-      <w:r>
-        <w:t>â€¢ [ ] Không ghi đè thay đổi chưa commit của người khác.</w:t>
-      </w:r>
-    </w:p>
-    <w:p>
-      <w:pPr>
-        <w:pStyle w:val="Normal"/>
-      </w:pPr>
-      <w:r>
-        <w:t>â€¢ [ ] Domain đúng `https://posvms.sharepos.vn/`.</w:t>
-      </w:r>
-    </w:p>
-    <w:p>
-      <w:pPr>
-        <w:pStyle w:val="Normal"/>
-      </w:pPr>
-      <w:r>
-        <w:t>â€¢ [ ] Version đúng.</w:t>
-      </w:r>
-    </w:p>
-    <w:p>
-      <w:pPr>
-        <w:pStyle w:val="Normal"/>
-      </w:pPr>
-      <w:r>
-        <w:t>â€¢ [ ] Build number lớn hơn bản trước.</w:t>
-      </w:r>
-    </w:p>
-    <w:p>
-      <w:pPr>
-        <w:pStyle w:val="Normal"/>
-      </w:pPr>
-      <w:r>
-        <w:t>â€¢ [ ] `pc_pos_setup.iss` đúng version và tên file.</w:t>
-      </w:r>
-    </w:p>
-    <w:p>
-      <w:pPr>
-        <w:pStyle w:val="Normal"/>
-      </w:pPr>
-      <w:r>
-        <w:t>â€¢ [ ] Format thành công.</w:t>
-      </w:r>
-    </w:p>
-    <w:p>
-      <w:pPr>
-        <w:pStyle w:val="Normal"/>
-      </w:pPr>
-      <w:r>
-        <w:t>â€¢ [ ] Analyze không có error.</w:t>
-      </w:r>
-    </w:p>
-    <w:p>
-      <w:pPr>
-        <w:pStyle w:val="Normal"/>
-      </w:pPr>
-      <w:r>
-        <w:t>â€¢ [ ] Shorebird login đúng tài khoản.</w:t>
-      </w:r>
-    </w:p>
-    <w:p>
-      <w:pPr>
-        <w:pStyle w:val="Normal"/>
-      </w:pPr>
-      <w:r>
-        <w:t>â€¢ [ ] Shorebird Android release thành công.</w:t>
-      </w:r>
-    </w:p>
-    <w:p>
-      <w:pPr>
-        <w:pStyle w:val="Normal"/>
-      </w:pPr>
-      <w:r>
-        <w:t>â€¢ [ ] APK đã được tạo.</w:t>
-      </w:r>
-    </w:p>
-    <w:p>
-      <w:pPr>
-        <w:pStyle w:val="Normal"/>
-      </w:pPr>
-      <w:r>
-        <w:t>â€¢ [ ] Shorebird Windows release thành công.</w:t>
-      </w:r>
-    </w:p>
-    <w:p>
-      <w:pPr>
-        <w:pStyle w:val="Normal"/>
-      </w:pPr>
-      <w:r>
-        <w:t>â€¢ [ ] Inno Setup compile thành công.</w:t>
-      </w:r>
-    </w:p>
-    <w:p>
-      <w:pPr>
-        <w:pStyle w:val="Normal"/>
-      </w:pPr>
-      <w:r>
-        <w:t>â€¢ [ ] Đã lấy lại `length` của EXE.</w:t>
-      </w:r>
-    </w:p>
-    <w:p>
-      <w:pPr>
-        <w:pStyle w:val="Normal"/>
-      </w:pPr>
-      <w:r>
-        <w:t>â€¢ [ ] Đã ký DSA lại cho EXE.</w:t>
-      </w:r>
-    </w:p>
-    <w:p>
-      <w:pPr>
-        <w:pStyle w:val="Normal"/>
-      </w:pPr>
-      <w:r>
-        <w:t>â€¢ [ ] DSA verify trả về `Verified OK`.</w:t>
-      </w:r>
-    </w:p>
-    <w:p>
-      <w:pPr>
-        <w:pStyle w:val="Normal"/>
-      </w:pPr>
-      <w:r>
-        <w:t>â€¢ [ ] XML đúng URL, version, build number, length và signature.</w:t>
-      </w:r>
-    </w:p>
-    <w:p>
-      <w:pPr>
-        <w:pStyle w:val="Normal"/>
-      </w:pPr>
-      <w:r>
-        <w:t>â€¢ [ ] Đã tính SHA-256 các file.</w:t>
-      </w:r>
-    </w:p>
-    <w:p>
-      <w:pPr>
-        <w:pStyle w:val="Normal"/>
-      </w:pPr>
-      <w:r>
-        <w:t>â€¢ [ ] ZIP có đúng EXE, APK và XML.</w:t>
-      </w:r>
-    </w:p>
-    <w:p>
-      <w:pPr>
-        <w:pStyle w:val="Normal"/>
-      </w:pPr>
-      <w:r>
-        <w:t>â€¢ [ ] ZIP không chứa private key.</w:t>
-      </w:r>
-    </w:p>
-    <w:p>
-      <w:pPr>
-        <w:pStyle w:val="Normal"/>
-      </w:pPr>
-      <w:r>
-        <w:t>â€¢ [ ] Đã cài thử APK.</w:t>
-      </w:r>
-    </w:p>
-    <w:p>
-      <w:pPr>
-        <w:pStyle w:val="Normal"/>
-      </w:pPr>
-      <w:r>
-        <w:t>â€¢ [ ] Đã cài thử installer Windows.</w:t>
-      </w:r>
-    </w:p>
-    <w:p>
-      <w:pPr>
-        <w:pStyle w:val="Normal"/>
-      </w:pPr>
-      <w:r>
-        <w:t>â€¢ [ ] Upload EXE/APK thành công trước khi bật XML.</w:t>
-      </w:r>
-    </w:p>
-    <w:p>
-      <w:pPr>
-        <w:pStyle w:val="Normal"/>
-      </w:pPr>
-      <w:r>
-        <w:t>â€¢ [ ] Đã lưu lại commit dùng để build.</w:t>
+        <w:t>• [ ] Source đã cập nhật mới nhất.</w:t>
+      </w:r>
+    </w:p>
+    <w:p>
+      <w:pPr>
+        <w:pStyle w:val="Normal"/>
+      </w:pPr>
+      <w:r>
+        <w:t>• [ ] Không ghi đè thay đổi chưa commit của người khác.</w:t>
+      </w:r>
+    </w:p>
+    <w:p>
+      <w:pPr>
+        <w:pStyle w:val="Normal"/>
+      </w:pPr>
+      <w:r>
+        <w:t>• [ ] Domain đúng `https://posvms.sharepos.vn/`.</w:t>
+      </w:r>
+    </w:p>
+    <w:p>
+      <w:pPr>
+        <w:pStyle w:val="Normal"/>
+      </w:pPr>
+      <w:r>
+        <w:t>• [ ] Version đúng.</w:t>
+      </w:r>
+    </w:p>
+    <w:p>
+      <w:pPr>
+        <w:pStyle w:val="Normal"/>
+      </w:pPr>
+      <w:r>
+        <w:t>• [ ] Build number lớn hơn bản trước.</w:t>
+      </w:r>
+    </w:p>
+    <w:p>
+      <w:pPr>
+        <w:pStyle w:val="Normal"/>
+      </w:pPr>
+      <w:r>
+        <w:t>• [ ] `pc_pos_setup.iss` đúng version và tên file.</w:t>
+      </w:r>
+    </w:p>
+    <w:p>
+      <w:pPr>
+        <w:pStyle w:val="Normal"/>
+      </w:pPr>
+      <w:r>
+        <w:t>• [ ] Format thành công.</w:t>
+      </w:r>
+    </w:p>
+    <w:p>
+      <w:pPr>
+        <w:pStyle w:val="Normal"/>
+      </w:pPr>
+      <w:r>
+        <w:t>• [ ] Analyze không có error.</w:t>
+      </w:r>
+    </w:p>
+    <w:p>
+      <w:pPr>
+        <w:pStyle w:val="Normal"/>
+      </w:pPr>
+      <w:r>
+        <w:t>• [ ] Shorebird login đúng tài khoản.</w:t>
+      </w:r>
+    </w:p>
+    <w:p>
+      <w:pPr>
+        <w:pStyle w:val="Normal"/>
+      </w:pPr>
+      <w:r>
+        <w:t>• [ ] Shorebird Android release thành công.</w:t>
+      </w:r>
+    </w:p>
+    <w:p>
+      <w:pPr>
+        <w:pStyle w:val="Normal"/>
+      </w:pPr>
+      <w:r>
+        <w:t>• [ ] APK đã được tạo.</w:t>
+      </w:r>
+    </w:p>
+    <w:p>
+      <w:pPr>
+        <w:pStyle w:val="Normal"/>
+      </w:pPr>
+      <w:r>
+        <w:t>• [ ] Shorebird Windows release thành công.</w:t>
+      </w:r>
+    </w:p>
+    <w:p>
+      <w:pPr>
+        <w:pStyle w:val="Normal"/>
+      </w:pPr>
+      <w:r>
+        <w:t>• [ ] Inno Setup compile thành công.</w:t>
+      </w:r>
+    </w:p>
+    <w:p>
+      <w:pPr>
+        <w:pStyle w:val="Normal"/>
+      </w:pPr>
+      <w:r>
+        <w:t>• [ ] Đã lấy lại `length` của EXE.</w:t>
+      </w:r>
+    </w:p>
+    <w:p>
+      <w:pPr>
+        <w:pStyle w:val="Normal"/>
+      </w:pPr>
+      <w:r>
+        <w:t>• [ ] Đã ký DSA lại cho EXE.</w:t>
+      </w:r>
+    </w:p>
+    <w:p>
+      <w:pPr>
+        <w:pStyle w:val="Normal"/>
+      </w:pPr>
+      <w:r>
+        <w:t>• [ ] DSA verify trả về `Verified OK`.</w:t>
+      </w:r>
+    </w:p>
+    <w:p>
+      <w:pPr>
+        <w:pStyle w:val="Normal"/>
+      </w:pPr>
+      <w:r>
+        <w:t>• [ ] XML đúng URL, version, build number, length và signature.</w:t>
+      </w:r>
+    </w:p>
+    <w:p>
+      <w:pPr>
+        <w:pStyle w:val="Normal"/>
+      </w:pPr>
+      <w:r>
+        <w:t>• [ ] Đã tính SHA-256 các file.</w:t>
+      </w:r>
+    </w:p>
+    <w:p>
+      <w:pPr>
+        <w:pStyle w:val="Normal"/>
+      </w:pPr>
+      <w:r>
+        <w:t>• [ ] ZIP có đúng EXE, APK và XML.</w:t>
+      </w:r>
+    </w:p>
+    <w:p>
+      <w:pPr>
+        <w:pStyle w:val="Normal"/>
+      </w:pPr>
+      <w:r>
+        <w:t>• [ ] ZIP không chứa private key.</w:t>
+      </w:r>
+    </w:p>
+    <w:p>
+      <w:pPr>
+        <w:pStyle w:val="Normal"/>
+      </w:pPr>
+      <w:r>
+        <w:t>• [ ] Đã cài thử APK.</w:t>
+      </w:r>
+    </w:p>
+    <w:p>
+      <w:pPr>
+        <w:pStyle w:val="Normal"/>
+      </w:pPr>
+      <w:r>
+        <w:t>• [ ] Đã cài thử installer Windows.</w:t>
+      </w:r>
+    </w:p>
+    <w:p>
+      <w:pPr>
+        <w:pStyle w:val="Normal"/>
+      </w:pPr>
+      <w:r>
+        <w:t>• [ ] Upload EXE/APK thành công trước khi bật XML.</w:t>
+      </w:r>
+    </w:p>
+    <w:p>
+      <w:pPr>
+        <w:pStyle w:val="Normal"/>
+      </w:pPr>
+      <w:r>
+        <w:t>• [ ] Đã lưu lại commit dùng để build.</w:t>
       </w:r>
     </w:p>
     <w:p>

</xml_diff>